<commit_message>
Condense week 5 progress report
</commit_message>
<xml_diff>
--- a/reports/服饰实例分割项目周报-第五周.docx
+++ b/reports/服饰实例分割项目周报-第五周.docx
@@ -42,16 +42,7 @@
           <w:rFonts w:ascii="SimSun" w:hAnsi="SimSun" w:eastAsia="宋体"/>
           <w:sz w:val="24"/>
         </w:rPr>
-        <w:t>本周主要围绕 3.1.2「语言引导的局部区域定位」做方向复盘和评估体系重构。根据导师反馈，前几周的训练和评估过度依赖 landmark pseudo-label 与规则 fallback，虽然能形成工程闭环，但缺少人工真实标注作为基准，容易把模型优化到伪标签几何上，而不是真正的语言引导定位能力。</w:t>
-      </w:r>
-    </w:p>
-    <w:p>
-      <w:r>
-        <w:rPr>
-          <w:rFonts w:ascii="SimSun" w:hAnsi="SimSun" w:eastAsia="宋体"/>
-          <w:sz w:val="24"/>
-        </w:rPr>
-        <w:t>因此我本周把重点从继续训练 weak ranker，调整为建立小规模人工 benchmark、复查 PRD 中 DINOv2/CLIP 的图文匹配路线、并重新整理 3.1.2 后续计划。当前结论是：DeepFashion2 可以提供 garment mask、bbox、category 和 landmark，但不能直接提供「右侧口袋」「袖口设计」「碎花图案」这类自然语言 query 对应的人工 bbox/mask。所以它适合作为弱监督和候选生成来源，但不足以单独支撑 PRD 级语言 grounding 训练。</w:t>
+        <w:t>本周主要围绕 3.1.2「语言引导的局部区域定位」做方向复盘和评估体系重构。根据导师反馈，前几周的训练和评估过度依赖 landmark pseudo-label + rule fallback，缺少人工真实标注作为基准，容易把模型优化到伪标签几何上。因此本周重点从继续训练 weak ranker，调整为建立小规模人工 benchmark、复查 PRD 中 DINOv2/CLIP 的图文匹配路线，并把后续主线改为 pretrained grounding。</w:t>
       </w:r>
     </w:p>
     <w:p>
@@ -59,7 +50,7 @@
         <w:pStyle w:val="Heading1"/>
       </w:pPr>
       <w:r>
-        <w:t>二、导师反馈与问题复盘</w:t>
+        <w:t>二、导师反馈与本周调整</w:t>
       </w:r>
     </w:p>
     <w:tbl>
@@ -69,15 +60,14 @@
         <w:tblLook w:firstColumn="1" w:firstRow="1" w:lastColumn="0" w:lastRow="0" w:noHBand="0" w:noVBand="1" w:val="04A0"/>
       </w:tblPr>
       <w:tblGrid>
-        <w:gridCol w:w="2412"/>
-        <w:gridCol w:w="2412"/>
-        <w:gridCol w:w="2412"/>
-        <w:gridCol w:w="2412"/>
+        <w:gridCol w:w="3216"/>
+        <w:gridCol w:w="3216"/>
+        <w:gridCol w:w="3216"/>
       </w:tblGrid>
       <w:tr>
         <w:tc>
           <w:tcPr>
-            <w:tcW w:type="dxa" w:w="2412"/>
+            <w:tcW w:type="dxa" w:w="3216"/>
             <w:shd w:fill="F2F4F7"/>
           </w:tcPr>
           <w:p>
@@ -91,13 +81,13 @@
                 <w:b/>
                 <w:sz w:val="20"/>
               </w:rPr>
-              <w:t>导师反馈</w:t>
+              <w:t>反馈/问题</w:t>
             </w:r>
           </w:p>
         </w:tc>
         <w:tc>
           <w:tcPr>
-            <w:tcW w:type="dxa" w:w="2412"/>
+            <w:tcW w:type="dxa" w:w="3216"/>
             <w:shd w:fill="F2F4F7"/>
           </w:tcPr>
           <w:p>
@@ -111,33 +101,13 @@
                 <w:b/>
                 <w:sz w:val="20"/>
               </w:rPr>
-              <w:t>暴露的问题</w:t>
+              <w:t>本周处理</w:t>
             </w:r>
           </w:p>
         </w:tc>
         <w:tc>
           <w:tcPr>
-            <w:tcW w:type="dxa" w:w="2412"/>
-            <w:shd w:fill="F2F4F7"/>
-          </w:tcPr>
-          <w:p>
-            <w:pPr>
-              <w:spacing w:after="40"/>
-            </w:pPr>
-            <w:r/>
-            <w:r>
-              <w:rPr>
-                <w:rFonts w:ascii="SimSun" w:hAnsi="SimSun" w:eastAsia="宋体"/>
-                <w:b/>
-                <w:sz w:val="20"/>
-              </w:rPr>
-              <w:t>本周调整</w:t>
-            </w:r>
-          </w:p>
-        </w:tc>
-        <w:tc>
-          <w:tcPr>
-            <w:tcW w:type="dxa" w:w="2412"/>
+            <w:tcW w:type="dxa" w:w="3216"/>
             <w:shd w:fill="F2F4F7"/>
           </w:tcPr>
           <w:p>
@@ -159,7 +129,7 @@
       <w:tr>
         <w:tc>
           <w:tcPr>
-            <w:tcW w:type="dxa" w:w="2412"/>
+            <w:tcW w:type="dxa" w:w="3216"/>
           </w:tcPr>
           <w:p>
             <w:pPr>
@@ -172,13 +142,13 @@
                 <w:b w:val="0"/>
                 <w:sz w:val="19"/>
               </w:rPr>
-              <w:t>训练/评估都来自 landmark pseudo-label + rule fallback</w:t>
+              <w:t>训练/评估都来自伪标签，可能围绕 noisy pseudo-label 跑偏</w:t>
             </w:r>
           </w:p>
         </w:tc>
         <w:tc>
           <w:tcPr>
-            <w:tcW w:type="dxa" w:w="2412"/>
+            <w:tcW w:type="dxa" w:w="3216"/>
           </w:tcPr>
           <w:p>
             <w:pPr>
@@ -191,13 +161,13 @@
                 <w:b w:val="0"/>
                 <w:sz w:val="19"/>
               </w:rPr>
-              <w:t>伪标签本身有噪声，继续优化 pseudo-label IoU 可能跑偏</w:t>
+              <w:t>建立人工 bbox benchmark，不使用 landmark 标注</w:t>
             </w:r>
           </w:p>
         </w:tc>
         <w:tc>
           <w:tcPr>
-            <w:tcW w:type="dxa" w:w="2412"/>
+            <w:tcW w:type="dxa" w:w="3216"/>
           </w:tcPr>
           <w:p>
             <w:pPr>
@@ -210,13 +180,15 @@
                 <w:b w:val="0"/>
                 <w:sz w:val="19"/>
               </w:rPr>
-              <w:t>建立人工 bbox benchmark，用人工框作为独立评估标准</w:t>
+              <w:t>manual benchmark 作为 3.1.2 主要评估依据</w:t>
             </w:r>
           </w:p>
         </w:tc>
+      </w:tr>
+      <w:tr>
         <w:tc>
           <w:tcPr>
-            <w:tcW w:type="dxa" w:w="2412"/>
+            <w:tcW w:type="dxa" w:w="3216"/>
           </w:tcPr>
           <w:p>
             <w:pPr>
@@ -229,53 +201,13 @@
                 <w:b w:val="0"/>
                 <w:sz w:val="19"/>
               </w:rPr>
-              <w:t>弱标签指标只保留为开发诊断，不再作为 PRD 结论</w:t>
-            </w:r>
-          </w:p>
-        </w:tc>
-      </w:tr>
-      <w:tr>
-        <w:tc>
-          <w:tcPr>
-            <w:tcW w:type="dxa" w:w="2412"/>
-          </w:tcPr>
-          <w:p>
-            <w:pPr>
-              <w:spacing w:after="40"/>
-            </w:pPr>
-            <w:r/>
-            <w:r>
-              <w:rPr>
-                <w:rFonts w:ascii="SimSun" w:hAnsi="SimSun" w:eastAsia="宋体"/>
-                <w:b w:val="0"/>
-                <w:sz w:val="19"/>
-              </w:rPr>
-              <w:t>候选区域生成利用 DeepFashion2 GT mask 和 landmark 先验</w:t>
+              <w:t>候选区域利用 GT mask 和 landmark 先验，候选级结果偏乐观</w:t>
             </w:r>
           </w:p>
         </w:tc>
         <w:tc>
           <w:tcPr>
-            <w:tcW w:type="dxa" w:w="2412"/>
-          </w:tcPr>
-          <w:p>
-            <w:pPr>
-              <w:spacing w:after="40"/>
-            </w:pPr>
-            <w:r/>
-            <w:r>
-              <w:rPr>
-                <w:rFonts w:ascii="SimSun" w:hAnsi="SimSun" w:eastAsia="宋体"/>
-                <w:b w:val="0"/>
-                <w:sz w:val="19"/>
-              </w:rPr>
-              <w:t>候选级验证结果偏乐观，存在数据泄露风险</w:t>
-            </w:r>
-          </w:p>
-        </w:tc>
-        <w:tc>
-          <w:tcPr>
-            <w:tcW w:type="dxa" w:w="2412"/>
+            <w:tcW w:type="dxa" w:w="3216"/>
           </w:tcPr>
           <w:p>
             <w:pPr>
@@ -294,7 +226,7 @@
         </w:tc>
         <w:tc>
           <w:tcPr>
-            <w:tcW w:type="dxa" w:w="2412"/>
+            <w:tcW w:type="dxa" w:w="3216"/>
           </w:tcPr>
           <w:p>
             <w:pPr>
@@ -307,7 +239,7 @@
                 <w:b w:val="0"/>
                 <w:sz w:val="19"/>
               </w:rPr>
-              <w:t>线上默认改为 heuristic-only，learned ranker 作为实验分支</w:t>
+              <w:t>线上默认 heuristic-only，learned ranker 只保留为实验分支</w:t>
             </w:r>
           </w:p>
         </w:tc>
@@ -315,7 +247,7 @@
       <w:tr>
         <w:tc>
           <w:tcPr>
-            <w:tcW w:type="dxa" w:w="2412"/>
+            <w:tcW w:type="dxa" w:w="3216"/>
           </w:tcPr>
           <w:p>
             <w:pPr>
@@ -328,13 +260,13 @@
                 <w:b w:val="0"/>
                 <w:sz w:val="19"/>
               </w:rPr>
-              <w:t>完整 pipeline 脱离 landmark 后明显退化</w:t>
+              <w:t>PRD 更接近 DINOv2/CLIP 区域特征与文本特征匹配路线</w:t>
             </w:r>
           </w:p>
         </w:tc>
         <w:tc>
           <w:tcPr>
-            <w:tcW w:type="dxa" w:w="2412"/>
+            <w:tcW w:type="dxa" w:w="3216"/>
           </w:tcPr>
           <w:p>
             <w:pPr>
@@ -347,13 +279,13 @@
                 <w:b w:val="0"/>
                 <w:sz w:val="19"/>
               </w:rPr>
-              <w:t>训练环境和真实推理环境不一致</w:t>
+              <w:t>重构 README、AutoDL setup 和 3.1.2 plan</w:t>
             </w:r>
           </w:p>
         </w:tc>
         <w:tc>
           <w:tcPr>
-            <w:tcW w:type="dxa" w:w="2412"/>
+            <w:tcW w:type="dxa" w:w="3216"/>
           </w:tcPr>
           <w:p>
             <w:pPr>
@@ -366,120 +298,18 @@
                 <w:b w:val="0"/>
                 <w:sz w:val="19"/>
               </w:rPr>
-              <w:t>用 3.1.1 预测结果 + 人工标注重新评估</w:t>
-            </w:r>
-          </w:p>
-        </w:tc>
-        <w:tc>
-          <w:tcPr>
-            <w:tcW w:type="dxa" w:w="2412"/>
-          </w:tcPr>
-          <w:p>
-            <w:pPr>
-              <w:spacing w:after="40"/>
-            </w:pPr>
-            <w:r/>
-            <w:r>
-              <w:rPr>
-                <w:rFonts w:ascii="SimSun" w:hAnsi="SimSun" w:eastAsia="宋体"/>
-                <w:b w:val="0"/>
-                <w:sz w:val="19"/>
-              </w:rPr>
-              <w:t>manual benchmark 才是当前最可信的判断依据</w:t>
-            </w:r>
-          </w:p>
-        </w:tc>
-      </w:tr>
-      <w:tr>
-        <w:tc>
-          <w:tcPr>
-            <w:tcW w:type="dxa" w:w="2412"/>
-          </w:tcPr>
-          <w:p>
-            <w:pPr>
-              <w:spacing w:after="40"/>
-            </w:pPr>
-            <w:r/>
-            <w:r>
-              <w:rPr>
-                <w:rFonts w:ascii="SimSun" w:hAnsi="SimSun" w:eastAsia="宋体"/>
-                <w:b w:val="0"/>
-                <w:sz w:val="19"/>
-              </w:rPr>
-              <w:t>文档提到 DINOv2/CLIP 图文匹配</w:t>
-            </w:r>
-          </w:p>
-        </w:tc>
-        <w:tc>
-          <w:tcPr>
-            <w:tcW w:type="dxa" w:w="2412"/>
-          </w:tcPr>
-          <w:p>
-            <w:pPr>
-              <w:spacing w:after="40"/>
-            </w:pPr>
-            <w:r/>
-            <w:r>
-              <w:rPr>
-                <w:rFonts w:ascii="SimSun" w:hAnsi="SimSun" w:eastAsia="宋体"/>
-                <w:b w:val="0"/>
-                <w:sz w:val="19"/>
-              </w:rPr>
-              <w:t>前期过度依赖 DeepFashion2 弱监督训练</w:t>
-            </w:r>
-          </w:p>
-        </w:tc>
-        <w:tc>
-          <w:tcPr>
-            <w:tcW w:type="dxa" w:w="2412"/>
-          </w:tcPr>
-          <w:p>
-            <w:pPr>
-              <w:spacing w:after="40"/>
-            </w:pPr>
-            <w:r/>
-            <w:r>
-              <w:rPr>
-                <w:rFonts w:ascii="SimSun" w:hAnsi="SimSun" w:eastAsia="宋体"/>
-                <w:b w:val="0"/>
-                <w:sz w:val="19"/>
-              </w:rPr>
-              <w:t>重构 3.1.2 计划，回到预训练 grounding / 图文匹配路线</w:t>
-            </w:r>
-          </w:p>
-        </w:tc>
-        <w:tc>
-          <w:tcPr>
-            <w:tcW w:type="dxa" w:w="2412"/>
-          </w:tcPr>
-          <w:p>
-            <w:pPr>
-              <w:spacing w:after="40"/>
-            </w:pPr>
-            <w:r/>
-            <w:r>
-              <w:rPr>
-                <w:rFonts w:ascii="SimSun" w:hAnsi="SimSun" w:eastAsia="宋体"/>
-                <w:b w:val="0"/>
-                <w:sz w:val="19"/>
-              </w:rPr>
-              <w:t>后续优先验证 GroundingDINO/OWL-ViT/CLIP 类 baseline</w:t>
+              <w:t>下一步优先验证 GroundingDINO/OWL-ViT/CLIP 类 baseline</w:t>
             </w:r>
           </w:p>
         </w:tc>
       </w:tr>
     </w:tbl>
     <w:p>
-      <w:r>
-        <w:br w:type="page"/>
-      </w:r>
-    </w:p>
-    <w:p>
       <w:pPr>
         <w:pStyle w:val="Heading1"/>
       </w:pPr>
       <w:r>
-        <w:t>三、人工 benchmark 建设与结果</w:t>
+        <w:t>三、Manual Benchmark 与策略修正</w:t>
       </w:r>
     </w:p>
     <w:p>
@@ -488,59 +318,7 @@
           <w:rFonts w:ascii="SimSun" w:hAnsi="SimSun" w:eastAsia="宋体"/>
           <w:sz w:val="24"/>
         </w:rPr>
-        <w:t>为了避免继续只围绕 pseudo-label IoU 调参，本周建立了一个小规模人工 bbox benchmark。标注时不使用 landmark，只根据图片和 query 手动框出目标区域；同时允许 impossible query 标为 unlabeled，例如裤子没有 neckline，避免把不存在的部位强行纳入评估。</w:t>
-      </w:r>
-    </w:p>
-    <w:p>
-      <w:pPr>
-        <w:pStyle w:val="ListBullet"/>
-        <w:ind w:left="360" w:hanging="173"/>
-      </w:pPr>
-      <w:r>
-        <w:rPr>
-          <w:rFonts w:ascii="SimSun" w:hAnsi="SimSun" w:eastAsia="宋体"/>
-          <w:sz w:val="24"/>
-        </w:rPr>
-        <w:t>实现人工标注 manifest 生成脚本，并加入 class-aware query templates，降低不合理 query 的比例。</w:t>
-      </w:r>
-    </w:p>
-    <w:p>
-      <w:pPr>
-        <w:pStyle w:val="ListBullet"/>
-        <w:ind w:left="360" w:hanging="173"/>
-      </w:pPr>
-      <w:r>
-        <w:rPr>
-          <w:rFonts w:ascii="SimSun" w:hAnsi="SimSun" w:eastAsia="宋体"/>
-          <w:sz w:val="24"/>
-        </w:rPr>
-        <w:t>实现浏览器 bbox 标注工具，支持拖框、保存 labeled JSONL、跳过不可标注样例。</w:t>
-      </w:r>
-    </w:p>
-    <w:p>
-      <w:pPr>
-        <w:pStyle w:val="ListBullet"/>
-        <w:ind w:left="360" w:hanging="173"/>
-      </w:pPr>
-      <w:r>
-        <w:rPr>
-          <w:rFonts w:ascii="SimSun" w:hAnsi="SimSun" w:eastAsia="宋体"/>
-          <w:sz w:val="24"/>
-        </w:rPr>
-        <w:t>实现多轮标注合并工具，将两轮人工标注合并为 122 条有效 labeled records。</w:t>
-      </w:r>
-    </w:p>
-    <w:p>
-      <w:pPr>
-        <w:pStyle w:val="ListBullet"/>
-        <w:ind w:left="360" w:hanging="173"/>
-      </w:pPr>
-      <w:r>
-        <w:rPr>
-          <w:rFonts w:ascii="SimSun" w:hAnsi="SimSun" w:eastAsia="宋体"/>
-          <w:sz w:val="24"/>
-        </w:rPr>
-        <w:t>实现 manual eval 脚本，用 3.1.1 预测结果 + 3.1.2 online policy 与人工 bbox 计算 IoU。</w:t>
+        <w:t>本周完成两轮人工标注合并，共得到 122 条有效 labeled records。标注时只根据图片和 query 手动画 bbox，不可标注 query 标为 unlabeled，不再用 DeepFashion2 landmark 作为评估真值。</w:t>
       </w:r>
     </w:p>
     <w:tbl>
@@ -593,7 +371,7 @@
                 <w:b/>
                 <w:sz w:val="20"/>
               </w:rPr>
-              <w:t>评估规模</w:t>
+              <w:t>规模</w:t>
             </w:r>
           </w:p>
         </w:tc>
@@ -672,7 +450,7 @@
               <w:rPr>
                 <w:rFonts w:ascii="SimSun" w:hAnsi="SimSun" w:eastAsia="宋体"/>
                 <w:b w:val="0"/>
-                <w:sz w:val="20"/>
+                <w:sz w:val="19"/>
               </w:rPr>
               <w:t>初始 heuristic</w:t>
             </w:r>
@@ -691,9 +469,9 @@
               <w:rPr>
                 <w:rFonts w:ascii="SimSun" w:hAnsi="SimSun" w:eastAsia="宋体"/>
                 <w:b w:val="0"/>
-                <w:sz w:val="20"/>
+                <w:sz w:val="19"/>
               </w:rPr>
-              <w:t>55 labeled</w:t>
+              <w:t>55</w:t>
             </w:r>
           </w:p>
         </w:tc>
@@ -710,7 +488,7 @@
               <w:rPr>
                 <w:rFonts w:ascii="SimSun" w:hAnsi="SimSun" w:eastAsia="宋体"/>
                 <w:b w:val="0"/>
-                <w:sz w:val="20"/>
+                <w:sz w:val="19"/>
               </w:rPr>
               <w:t>0.2544</w:t>
             </w:r>
@@ -729,7 +507,7 @@
               <w:rPr>
                 <w:rFonts w:ascii="SimSun" w:hAnsi="SimSun" w:eastAsia="宋体"/>
                 <w:b w:val="0"/>
-                <w:sz w:val="20"/>
+                <w:sz w:val="19"/>
               </w:rPr>
               <w:t>0.4000 / 0.2545</w:t>
             </w:r>
@@ -748,7 +526,7 @@
               <w:rPr>
                 <w:rFonts w:ascii="SimSun" w:hAnsi="SimSun" w:eastAsia="宋体"/>
                 <w:b w:val="0"/>
-                <w:sz w:val="20"/>
+                <w:sz w:val="19"/>
               </w:rPr>
               <w:t>优于 learned hybrid</w:t>
             </w:r>
@@ -769,7 +547,7 @@
               <w:rPr>
                 <w:rFonts w:ascii="SimSun" w:hAnsi="SimSun" w:eastAsia="宋体"/>
                 <w:b w:val="0"/>
-                <w:sz w:val="20"/>
+                <w:sz w:val="19"/>
               </w:rPr>
               <w:t>candidate-listwise hybrid</w:t>
             </w:r>
@@ -788,9 +566,9 @@
               <w:rPr>
                 <w:rFonts w:ascii="SimSun" w:hAnsi="SimSun" w:eastAsia="宋体"/>
                 <w:b w:val="0"/>
-                <w:sz w:val="20"/>
+                <w:sz w:val="19"/>
               </w:rPr>
-              <w:t>55 labeled</w:t>
+              <w:t>55</w:t>
             </w:r>
           </w:p>
         </w:tc>
@@ -807,7 +585,7 @@
               <w:rPr>
                 <w:rFonts w:ascii="SimSun" w:hAnsi="SimSun" w:eastAsia="宋体"/>
                 <w:b w:val="0"/>
-                <w:sz w:val="20"/>
+                <w:sz w:val="19"/>
               </w:rPr>
               <w:t>0.2324</w:t>
             </w:r>
@@ -826,7 +604,7 @@
               <w:rPr>
                 <w:rFonts w:ascii="SimSun" w:hAnsi="SimSun" w:eastAsia="宋体"/>
                 <w:b w:val="0"/>
-                <w:sz w:val="20"/>
+                <w:sz w:val="19"/>
               </w:rPr>
               <w:t>0.3455 / 0.2000</w:t>
             </w:r>
@@ -845,7 +623,7 @@
               <w:rPr>
                 <w:rFonts w:ascii="SimSun" w:hAnsi="SimSun" w:eastAsia="宋体"/>
                 <w:b w:val="0"/>
-                <w:sz w:val="20"/>
+                <w:sz w:val="19"/>
               </w:rPr>
               <w:t>人工评估未带来收益</w:t>
             </w:r>
@@ -866,7 +644,7 @@
               <w:rPr>
                 <w:rFonts w:ascii="SimSun" w:hAnsi="SimSun" w:eastAsia="宋体"/>
                 <w:b w:val="0"/>
-                <w:sz w:val="20"/>
+                <w:sz w:val="19"/>
               </w:rPr>
               <w:t>合并人工集 baseline</w:t>
             </w:r>
@@ -885,9 +663,9 @@
               <w:rPr>
                 <w:rFonts w:ascii="SimSun" w:hAnsi="SimSun" w:eastAsia="宋体"/>
                 <w:b w:val="0"/>
-                <w:sz w:val="20"/>
+                <w:sz w:val="19"/>
               </w:rPr>
-              <w:t>122 labeled</w:t>
+              <w:t>122</w:t>
             </w:r>
           </w:p>
         </w:tc>
@@ -904,7 +682,7 @@
               <w:rPr>
                 <w:rFonts w:ascii="SimSun" w:hAnsi="SimSun" w:eastAsia="宋体"/>
                 <w:b w:val="0"/>
-                <w:sz w:val="20"/>
+                <w:sz w:val="19"/>
               </w:rPr>
               <w:t>0.2812</w:t>
             </w:r>
@@ -923,7 +701,7 @@
               <w:rPr>
                 <w:rFonts w:ascii="SimSun" w:hAnsi="SimSun" w:eastAsia="宋体"/>
                 <w:b w:val="0"/>
-                <w:sz w:val="20"/>
+                <w:sz w:val="19"/>
               </w:rPr>
               <w:t>0.4344 / 0.2623</w:t>
             </w:r>
@@ -942,7 +720,7 @@
               <w:rPr>
                 <w:rFonts w:ascii="SimSun" w:hAnsi="SimSun" w:eastAsia="宋体"/>
                 <w:b w:val="0"/>
-                <w:sz w:val="20"/>
+                <w:sz w:val="19"/>
               </w:rPr>
               <w:t>作为后续比较基线</w:t>
             </w:r>
@@ -963,9 +741,9 @@
               <w:rPr>
                 <w:rFonts w:ascii="SimSun" w:hAnsi="SimSun" w:eastAsia="宋体"/>
                 <w:b w:val="0"/>
-                <w:sz w:val="20"/>
+                <w:sz w:val="19"/>
               </w:rPr>
-              <w:t>failure review 后 refinement</w:t>
+              <w:t>failure review + rule refinement</w:t>
             </w:r>
           </w:p>
         </w:tc>
@@ -982,9 +760,9 @@
               <w:rPr>
                 <w:rFonts w:ascii="SimSun" w:hAnsi="SimSun" w:eastAsia="宋体"/>
                 <w:b w:val="0"/>
-                <w:sz w:val="20"/>
+                <w:sz w:val="19"/>
               </w:rPr>
-              <w:t>122 labeled</w:t>
+              <w:t>122</w:t>
             </w:r>
           </w:p>
         </w:tc>
@@ -1001,104 +779,7 @@
               <w:rPr>
                 <w:rFonts w:ascii="SimSun" w:hAnsi="SimSun" w:eastAsia="宋体"/>
                 <w:b w:val="0"/>
-                <w:sz w:val="20"/>
-              </w:rPr>
-              <w:t>0.3064</w:t>
-            </w:r>
-          </w:p>
-        </w:tc>
-        <w:tc>
-          <w:tcPr>
-            <w:tcW w:type="dxa" w:w="1930"/>
-          </w:tcPr>
-          <w:p>
-            <w:pPr>
-              <w:spacing w:after="40"/>
-            </w:pPr>
-            <w:r/>
-            <w:r>
-              <w:rPr>
-                <w:rFonts w:ascii="SimSun" w:hAnsi="SimSun" w:eastAsia="宋体"/>
-                <w:b w:val="0"/>
-                <w:sz w:val="20"/>
-              </w:rPr>
-              <w:t>0.4754 / 0.2787</w:t>
-            </w:r>
-          </w:p>
-        </w:tc>
-        <w:tc>
-          <w:tcPr>
-            <w:tcW w:type="dxa" w:w="1930"/>
-          </w:tcPr>
-          <w:p>
-            <w:pPr>
-              <w:spacing w:after="40"/>
-            </w:pPr>
-            <w:r/>
-            <w:r>
-              <w:rPr>
-                <w:rFonts w:ascii="SimSun" w:hAnsi="SimSun" w:eastAsia="宋体"/>
-                <w:b w:val="0"/>
-                <w:sz w:val="20"/>
-              </w:rPr>
-              <w:t>pocket/waist 明显提升</w:t>
-            </w:r>
-          </w:p>
-        </w:tc>
-      </w:tr>
-      <w:tr>
-        <w:tc>
-          <w:tcPr>
-            <w:tcW w:type="dxa" w:w="1930"/>
-          </w:tcPr>
-          <w:p>
-            <w:pPr>
-              <w:spacing w:after="40"/>
-            </w:pPr>
-            <w:r/>
-            <w:r>
-              <w:rPr>
-                <w:rFonts w:ascii="SimSun" w:hAnsi="SimSun" w:eastAsia="宋体"/>
-                <w:b w:val="0"/>
-                <w:sz w:val="20"/>
-              </w:rPr>
-              <w:t>cuff variant refinement</w:t>
-            </w:r>
-          </w:p>
-        </w:tc>
-        <w:tc>
-          <w:tcPr>
-            <w:tcW w:type="dxa" w:w="1930"/>
-          </w:tcPr>
-          <w:p>
-            <w:pPr>
-              <w:spacing w:after="40"/>
-            </w:pPr>
-            <w:r/>
-            <w:r>
-              <w:rPr>
-                <w:rFonts w:ascii="SimSun" w:hAnsi="SimSun" w:eastAsia="宋体"/>
-                <w:b w:val="0"/>
-                <w:sz w:val="20"/>
-              </w:rPr>
-              <w:t>122 labeled</w:t>
-            </w:r>
-          </w:p>
-        </w:tc>
-        <w:tc>
-          <w:tcPr>
-            <w:tcW w:type="dxa" w:w="1930"/>
-          </w:tcPr>
-          <w:p>
-            <w:pPr>
-              <w:spacing w:after="40"/>
-            </w:pPr>
-            <w:r/>
-            <w:r>
-              <w:rPr>
-                <w:rFonts w:ascii="SimSun" w:hAnsi="SimSun" w:eastAsia="宋体"/>
-                <w:b w:val="0"/>
-                <w:sz w:val="20"/>
+                <w:sz w:val="19"/>
               </w:rPr>
               <w:t>0.3123</w:t>
             </w:r>
@@ -1117,7 +798,7 @@
               <w:rPr>
                 <w:rFonts w:ascii="SimSun" w:hAnsi="SimSun" w:eastAsia="宋体"/>
                 <w:b w:val="0"/>
-                <w:sz w:val="20"/>
+                <w:sz w:val="19"/>
               </w:rPr>
               <w:t>0.4836 / 0.2705</w:t>
             </w:r>
@@ -1136,857 +817,9 @@
               <w:rPr>
                 <w:rFonts w:ascii="SimSun" w:hAnsi="SimSun" w:eastAsia="宋体"/>
                 <w:b w:val="0"/>
-                <w:sz w:val="20"/>
-              </w:rPr>
-              <w:t>整体继续提升，袖口仍是瓶颈</w:t>
-            </w:r>
-          </w:p>
-        </w:tc>
-      </w:tr>
-    </w:tbl>
-    <w:p>
-      <w:pPr>
-        <w:pStyle w:val="Heading1"/>
-      </w:pPr>
-      <w:r>
-        <w:t>四、Failure Review 与策略修正</w:t>
-      </w:r>
-    </w:p>
-    <w:p>
-      <w:r>
-        <w:rPr>
-          <w:rFonts w:ascii="SimSun" w:hAnsi="SimSun" w:eastAsia="宋体"/>
-          <w:sz w:val="24"/>
-        </w:rPr>
-        <w:t>在人工 benchmark 上，candidate-listwise hybrid 没有超过 heuristic baseline，因此我把 candidate listwise ranker 从 online path 暂时关掉，避免后续误传 --ranker-checkpoint 导致结果变差。随后我导出低 IoU failure cases，并用 HTML review 页面逐类复查 cuff、pocket、waist 的失败原因。</w:t>
-      </w:r>
-    </w:p>
-    <w:tbl>
-      <w:tblPr>
-        <w:tblStyle w:val="TableGrid"/>
-        <w:tblW w:type="auto" w:w="0"/>
-        <w:tblLook w:firstColumn="1" w:firstRow="1" w:lastColumn="0" w:lastRow="0" w:noHBand="0" w:noVBand="1" w:val="04A0"/>
-      </w:tblPr>
-      <w:tblGrid>
-        <w:gridCol w:w="2412"/>
-        <w:gridCol w:w="2412"/>
-        <w:gridCol w:w="2412"/>
-        <w:gridCol w:w="2412"/>
-      </w:tblGrid>
-      <w:tr>
-        <w:tc>
-          <w:tcPr>
-            <w:tcW w:type="dxa" w:w="2412"/>
-            <w:shd w:fill="F2F4F7"/>
-          </w:tcPr>
-          <w:p>
-            <w:pPr>
-              <w:spacing w:after="40"/>
-            </w:pPr>
-            <w:r/>
-            <w:r>
-              <w:rPr>
-                <w:rFonts w:ascii="SimSun" w:hAnsi="SimSun" w:eastAsia="宋体"/>
-                <w:b/>
-                <w:sz w:val="20"/>
-              </w:rPr>
-              <w:t>问题区域</w:t>
-            </w:r>
-          </w:p>
-        </w:tc>
-        <w:tc>
-          <w:tcPr>
-            <w:tcW w:type="dxa" w:w="2412"/>
-            <w:shd w:fill="F2F4F7"/>
-          </w:tcPr>
-          <w:p>
-            <w:pPr>
-              <w:spacing w:after="40"/>
-            </w:pPr>
-            <w:r/>
-            <w:r>
-              <w:rPr>
-                <w:rFonts w:ascii="SimSun" w:hAnsi="SimSun" w:eastAsia="宋体"/>
-                <w:b/>
-                <w:sz w:val="20"/>
-              </w:rPr>
-              <w:t>主要失败原因</w:t>
-            </w:r>
-          </w:p>
-        </w:tc>
-        <w:tc>
-          <w:tcPr>
-            <w:tcW w:type="dxa" w:w="2412"/>
-            <w:shd w:fill="F2F4F7"/>
-          </w:tcPr>
-          <w:p>
-            <w:pPr>
-              <w:spacing w:after="40"/>
-            </w:pPr>
-            <w:r/>
-            <w:r>
-              <w:rPr>
-                <w:rFonts w:ascii="SimSun" w:hAnsi="SimSun" w:eastAsia="宋体"/>
-                <w:b/>
-                <w:sz w:val="20"/>
-              </w:rPr>
-              <w:t>本周修正</w:t>
-            </w:r>
-          </w:p>
-        </w:tc>
-        <w:tc>
-          <w:tcPr>
-            <w:tcW w:type="dxa" w:w="2412"/>
-            <w:shd w:fill="F2F4F7"/>
-          </w:tcPr>
-          <w:p>
-            <w:pPr>
-              <w:spacing w:after="40"/>
-            </w:pPr>
-            <w:r/>
-            <w:r>
-              <w:rPr>
-                <w:rFonts w:ascii="SimSun" w:hAnsi="SimSun" w:eastAsia="宋体"/>
-                <w:b/>
-                <w:sz w:val="20"/>
-              </w:rPr>
-              <w:t>结果/判断</w:t>
-            </w:r>
-          </w:p>
-        </w:tc>
-      </w:tr>
-      <w:tr>
-        <w:tc>
-          <w:tcPr>
-            <w:tcW w:type="dxa" w:w="2412"/>
-          </w:tcPr>
-          <w:p>
-            <w:pPr>
-              <w:spacing w:after="40"/>
-            </w:pPr>
-            <w:r/>
-            <w:r>
-              <w:rPr>
-                <w:rFonts w:ascii="SimSun" w:hAnsi="SimSun" w:eastAsia="宋体"/>
-                <w:b w:val="0"/>
                 <w:sz w:val="19"/>
               </w:rPr>
-              <w:t>cuff</w:t>
-            </w:r>
-          </w:p>
-        </w:tc>
-        <w:tc>
-          <w:tcPr>
-            <w:tcW w:type="dxa" w:w="2412"/>
-          </w:tcPr>
-          <w:p>
-            <w:pPr>
-              <w:spacing w:after="40"/>
-            </w:pPr>
-            <w:r/>
-            <w:r>
-              <w:rPr>
-                <w:rFonts w:ascii="SimSun" w:hAnsi="SimSun" w:eastAsia="宋体"/>
-                <w:b w:val="0"/>
-                <w:sz w:val="19"/>
-              </w:rPr>
-              <w:t>短袖/袖窿和长袖袖口混在一起，纯几何框容易选到整条袖子</w:t>
-            </w:r>
-          </w:p>
-        </w:tc>
-        <w:tc>
-          <w:tcPr>
-            <w:tcW w:type="dxa" w:w="2412"/>
-          </w:tcPr>
-          <w:p>
-            <w:pPr>
-              <w:spacing w:after="40"/>
-            </w:pPr>
-            <w:r/>
-            <w:r>
-              <w:rPr>
-                <w:rFonts w:ascii="SimSun" w:hAnsi="SimSun" w:eastAsia="宋体"/>
-                <w:b w:val="0"/>
-                <w:sz w:val="19"/>
-              </w:rPr>
-              <w:t>增加 upper-sleeve 与 lower-terminal cuff 两类候选</w:t>
-            </w:r>
-          </w:p>
-        </w:tc>
-        <w:tc>
-          <w:tcPr>
-            <w:tcW w:type="dxa" w:w="2412"/>
-          </w:tcPr>
-          <w:p>
-            <w:pPr>
-              <w:spacing w:after="40"/>
-            </w:pPr>
-            <w:r/>
-            <w:r>
-              <w:rPr>
-                <w:rFonts w:ascii="SimSun" w:hAnsi="SimSun" w:eastAsia="宋体"/>
-                <w:b w:val="0"/>
-                <w:sz w:val="19"/>
-              </w:rPr>
-              <w:t>IoU 0.0190 -&gt; 0.0904，但仍然低，说明需要视觉 grounding</w:t>
-            </w:r>
-          </w:p>
-        </w:tc>
-      </w:tr>
-      <w:tr>
-        <w:tc>
-          <w:tcPr>
-            <w:tcW w:type="dxa" w:w="2412"/>
-          </w:tcPr>
-          <w:p>
-            <w:pPr>
-              <w:spacing w:after="40"/>
-            </w:pPr>
-            <w:r/>
-            <w:r>
-              <w:rPr>
-                <w:rFonts w:ascii="SimSun" w:hAnsi="SimSun" w:eastAsia="宋体"/>
-                <w:b w:val="0"/>
-                <w:sz w:val="19"/>
-              </w:rPr>
-              <w:t>pocket</w:t>
-            </w:r>
-          </w:p>
-        </w:tc>
-        <w:tc>
-          <w:tcPr>
-            <w:tcW w:type="dxa" w:w="2412"/>
-          </w:tcPr>
-          <w:p>
-            <w:pPr>
-              <w:spacing w:after="40"/>
-            </w:pPr>
-            <w:r/>
-            <w:r>
-              <w:rPr>
-                <w:rFonts w:ascii="SimSun" w:hAnsi="SimSun" w:eastAsia="宋体"/>
-                <w:b w:val="0"/>
-                <w:sz w:val="19"/>
-              </w:rPr>
-              <w:t>左右方向按图像坐标理解，和服饰/穿着者左右不一致</w:t>
-            </w:r>
-          </w:p>
-        </w:tc>
-        <w:tc>
-          <w:tcPr>
-            <w:tcW w:type="dxa" w:w="2412"/>
-          </w:tcPr>
-          <w:p>
-            <w:pPr>
-              <w:spacing w:after="40"/>
-            </w:pPr>
-            <w:r/>
-            <w:r>
-              <w:rPr>
-                <w:rFonts w:ascii="SimSun" w:hAnsi="SimSun" w:eastAsia="宋体"/>
-                <w:b w:val="0"/>
-                <w:sz w:val="19"/>
-              </w:rPr>
-              <w:t>side-specific pocket 改为 wearer/garment left-right convention</w:t>
-            </w:r>
-          </w:p>
-        </w:tc>
-        <w:tc>
-          <w:tcPr>
-            <w:tcW w:type="dxa" w:w="2412"/>
-          </w:tcPr>
-          <w:p>
-            <w:pPr>
-              <w:spacing w:after="40"/>
-            </w:pPr>
-            <w:r/>
-            <w:r>
-              <w:rPr>
-                <w:rFonts w:ascii="SimSun" w:hAnsi="SimSun" w:eastAsia="宋体"/>
-                <w:b w:val="0"/>
-                <w:sz w:val="19"/>
-              </w:rPr>
-              <w:t>IoU 0.0000 -&gt; 0.1337，方向修正有效</w:t>
-            </w:r>
-          </w:p>
-        </w:tc>
-      </w:tr>
-      <w:tr>
-        <w:tc>
-          <w:tcPr>
-            <w:tcW w:type="dxa" w:w="2412"/>
-          </w:tcPr>
-          <w:p>
-            <w:pPr>
-              <w:spacing w:after="40"/>
-            </w:pPr>
-            <w:r/>
-            <w:r>
-              <w:rPr>
-                <w:rFonts w:ascii="SimSun" w:hAnsi="SimSun" w:eastAsia="宋体"/>
-                <w:b w:val="0"/>
-                <w:sz w:val="19"/>
-              </w:rPr>
-              <w:t>waist</w:t>
-            </w:r>
-          </w:p>
-        </w:tc>
-        <w:tc>
-          <w:tcPr>
-            <w:tcW w:type="dxa" w:w="2412"/>
-          </w:tcPr>
-          <w:p>
-            <w:pPr>
-              <w:spacing w:after="40"/>
-            </w:pPr>
-            <w:r/>
-            <w:r>
-              <w:rPr>
-                <w:rFonts w:ascii="SimSun" w:hAnsi="SimSun" w:eastAsia="宋体"/>
-                <w:b w:val="0"/>
-                <w:sz w:val="19"/>
-              </w:rPr>
-              <w:t>不同类别腰部位置差异大，裤子/裙子/连衣裙不能用同一纵向窗口</w:t>
-            </w:r>
-          </w:p>
-        </w:tc>
-        <w:tc>
-          <w:tcPr>
-            <w:tcW w:type="dxa" w:w="2412"/>
-          </w:tcPr>
-          <w:p>
-            <w:pPr>
-              <w:spacing w:after="40"/>
-            </w:pPr>
-            <w:r/>
-            <w:r>
-              <w:rPr>
-                <w:rFonts w:ascii="SimSun" w:hAnsi="SimSun" w:eastAsia="宋体"/>
-                <w:b w:val="0"/>
-                <w:sz w:val="19"/>
-              </w:rPr>
-              <w:t>根据 garment category 使用不同 upper-band/waist-band 几何</w:t>
-            </w:r>
-          </w:p>
-        </w:tc>
-        <w:tc>
-          <w:tcPr>
-            <w:tcW w:type="dxa" w:w="2412"/>
-          </w:tcPr>
-          <w:p>
-            <w:pPr>
-              <w:spacing w:after="40"/>
-            </w:pPr>
-            <w:r/>
-            <w:r>
-              <w:rPr>
-                <w:rFonts w:ascii="SimSun" w:hAnsi="SimSun" w:eastAsia="宋体"/>
-                <w:b w:val="0"/>
-                <w:sz w:val="19"/>
-              </w:rPr>
-              <w:t>IoU 0.0961 -&gt; 0.2306，类别感知规则有效</w:t>
-            </w:r>
-          </w:p>
-        </w:tc>
-      </w:tr>
-      <w:tr>
-        <w:tc>
-          <w:tcPr>
-            <w:tcW w:type="dxa" w:w="2412"/>
-          </w:tcPr>
-          <w:p>
-            <w:pPr>
-              <w:spacing w:after="40"/>
-            </w:pPr>
-            <w:r/>
-            <w:r>
-              <w:rPr>
-                <w:rFonts w:ascii="SimSun" w:hAnsi="SimSun" w:eastAsia="宋体"/>
-                <w:b w:val="0"/>
-                <w:sz w:val="19"/>
-              </w:rPr>
-              <w:t>zipper / pattern / decoration</w:t>
-            </w:r>
-          </w:p>
-        </w:tc>
-        <w:tc>
-          <w:tcPr>
-            <w:tcW w:type="dxa" w:w="2412"/>
-          </w:tcPr>
-          <w:p>
-            <w:pPr>
-              <w:spacing w:after="40"/>
-            </w:pPr>
-            <w:r/>
-            <w:r>
-              <w:rPr>
-                <w:rFonts w:ascii="SimSun" w:hAnsi="SimSun" w:eastAsia="宋体"/>
-                <w:b w:val="0"/>
-                <w:sz w:val="19"/>
-              </w:rPr>
-              <w:t>目标小且依赖真实视觉纹理，规则候选不稳定</w:t>
-            </w:r>
-          </w:p>
-        </w:tc>
-        <w:tc>
-          <w:tcPr>
-            <w:tcW w:type="dxa" w:w="2412"/>
-          </w:tcPr>
-          <w:p>
-            <w:pPr>
-              <w:spacing w:after="40"/>
-            </w:pPr>
-            <w:r/>
-            <w:r>
-              <w:rPr>
-                <w:rFonts w:ascii="SimSun" w:hAnsi="SimSun" w:eastAsia="宋体"/>
-                <w:b w:val="0"/>
-                <w:sz w:val="19"/>
-              </w:rPr>
-              <w:t>暂不继续强行规则调参，放入 pretrained grounding 下一阶段验证</w:t>
-            </w:r>
-          </w:p>
-        </w:tc>
-        <w:tc>
-          <w:tcPr>
-            <w:tcW w:type="dxa" w:w="2412"/>
-          </w:tcPr>
-          <w:p>
-            <w:pPr>
-              <w:spacing w:after="40"/>
-            </w:pPr>
-            <w:r/>
-            <w:r>
-              <w:rPr>
-                <w:rFonts w:ascii="SimSun" w:hAnsi="SimSun" w:eastAsia="宋体"/>
-                <w:b w:val="0"/>
-                <w:sz w:val="19"/>
-              </w:rPr>
-              <w:t>更适合用 GroundingDINO/CLIP/SAM 类图文定位能力处理</w:t>
-            </w:r>
-          </w:p>
-        </w:tc>
-      </w:tr>
-    </w:tbl>
-    <w:p>
-      <w:pPr>
-        <w:pStyle w:val="Heading1"/>
-      </w:pPr>
-      <w:r>
-        <w:t>五、3.1.2 路线重构</w:t>
-      </w:r>
-    </w:p>
-    <w:p>
-      <w:r>
-        <w:rPr>
-          <w:rFonts w:ascii="SimSun" w:hAnsi="SimSun" w:eastAsia="宋体"/>
-          <w:sz w:val="24"/>
-        </w:rPr>
-        <w:t>复查 PRD 后，我认为文档真正暗示的路线不是固定部位分割，也不是完全依赖 DeepFashion2 pseudo-label 训练，而是「候选区域/区域特征 + 文本特征相似度匹配」的预训练图文 grounding 路线。我们之前做的 weak-label ranker 是为了解决数据不足的一种工程替代方案，但现在看只能作为探索实验，不能作为最终主线。</w:t>
-      </w:r>
-    </w:p>
-    <w:tbl>
-      <w:tblPr>
-        <w:tblStyle w:val="TableGrid"/>
-        <w:tblW w:type="auto" w:w="0"/>
-        <w:tblLook w:firstColumn="1" w:firstRow="1" w:lastColumn="0" w:lastRow="0" w:noHBand="0" w:noVBand="1" w:val="04A0"/>
-      </w:tblPr>
-      <w:tblGrid>
-        <w:gridCol w:w="2412"/>
-        <w:gridCol w:w="2412"/>
-        <w:gridCol w:w="2412"/>
-        <w:gridCol w:w="2412"/>
-      </w:tblGrid>
-      <w:tr>
-        <w:tc>
-          <w:tcPr>
-            <w:tcW w:type="dxa" w:w="2412"/>
-            <w:shd w:fill="F2F4F7"/>
-          </w:tcPr>
-          <w:p>
-            <w:pPr>
-              <w:spacing w:after="40"/>
-            </w:pPr>
-            <w:r/>
-            <w:r>
-              <w:rPr>
-                <w:rFonts w:ascii="SimSun" w:hAnsi="SimSun" w:eastAsia="宋体"/>
-                <w:b/>
-                <w:sz w:val="20"/>
-              </w:rPr>
-              <w:t>路线</w:t>
-            </w:r>
-          </w:p>
-        </w:tc>
-        <w:tc>
-          <w:tcPr>
-            <w:tcW w:type="dxa" w:w="2412"/>
-            <w:shd w:fill="F2F4F7"/>
-          </w:tcPr>
-          <w:p>
-            <w:pPr>
-              <w:spacing w:after="40"/>
-            </w:pPr>
-            <w:r/>
-            <w:r>
-              <w:rPr>
-                <w:rFonts w:ascii="SimSun" w:hAnsi="SimSun" w:eastAsia="宋体"/>
-                <w:b/>
-                <w:sz w:val="20"/>
-              </w:rPr>
-              <w:t>之前做法</w:t>
-            </w:r>
-          </w:p>
-        </w:tc>
-        <w:tc>
-          <w:tcPr>
-            <w:tcW w:type="dxa" w:w="2412"/>
-            <w:shd w:fill="F2F4F7"/>
-          </w:tcPr>
-          <w:p>
-            <w:pPr>
-              <w:spacing w:after="40"/>
-            </w:pPr>
-            <w:r/>
-            <w:r>
-              <w:rPr>
-                <w:rFonts w:ascii="SimSun" w:hAnsi="SimSun" w:eastAsia="宋体"/>
-                <w:b/>
-                <w:sz w:val="20"/>
-              </w:rPr>
-              <w:t>问题</w:t>
-            </w:r>
-          </w:p>
-        </w:tc>
-        <w:tc>
-          <w:tcPr>
-            <w:tcW w:type="dxa" w:w="2412"/>
-            <w:shd w:fill="F2F4F7"/>
-          </w:tcPr>
-          <w:p>
-            <w:pPr>
-              <w:spacing w:after="40"/>
-            </w:pPr>
-            <w:r/>
-            <w:r>
-              <w:rPr>
-                <w:rFonts w:ascii="SimSun" w:hAnsi="SimSun" w:eastAsia="宋体"/>
-                <w:b/>
-                <w:sz w:val="20"/>
-              </w:rPr>
-              <w:t>调整后做法</w:t>
-            </w:r>
-          </w:p>
-        </w:tc>
-      </w:tr>
-      <w:tr>
-        <w:tc>
-          <w:tcPr>
-            <w:tcW w:type="dxa" w:w="2412"/>
-          </w:tcPr>
-          <w:p>
-            <w:pPr>
-              <w:spacing w:after="40"/>
-            </w:pPr>
-            <w:r/>
-            <w:r>
-              <w:rPr>
-                <w:rFonts w:ascii="SimSun" w:hAnsi="SimSun" w:eastAsia="宋体"/>
-                <w:b w:val="0"/>
-                <w:sz w:val="19"/>
-              </w:rPr>
-              <w:t>训练数据</w:t>
-            </w:r>
-          </w:p>
-        </w:tc>
-        <w:tc>
-          <w:tcPr>
-            <w:tcW w:type="dxa" w:w="2412"/>
-          </w:tcPr>
-          <w:p>
-            <w:pPr>
-              <w:spacing w:after="40"/>
-            </w:pPr>
-            <w:r/>
-            <w:r>
-              <w:rPr>
-                <w:rFonts w:ascii="SimSun" w:hAnsi="SimSun" w:eastAsia="宋体"/>
-                <w:b w:val="0"/>
-                <w:sz w:val="19"/>
-              </w:rPr>
-              <w:t>DeepFashion2 mask + landmark 构造 pseudo-label</w:t>
-            </w:r>
-          </w:p>
-        </w:tc>
-        <w:tc>
-          <w:tcPr>
-            <w:tcW w:type="dxa" w:w="2412"/>
-          </w:tcPr>
-          <w:p>
-            <w:pPr>
-              <w:spacing w:after="40"/>
-            </w:pPr>
-            <w:r/>
-            <w:r>
-              <w:rPr>
-                <w:rFonts w:ascii="SimSun" w:hAnsi="SimSun" w:eastAsia="宋体"/>
-                <w:b w:val="0"/>
-                <w:sz w:val="19"/>
-              </w:rPr>
-              <w:t>没有 query-level 人工真值，容易学到几何先验</w:t>
-            </w:r>
-          </w:p>
-        </w:tc>
-        <w:tc>
-          <w:tcPr>
-            <w:tcW w:type="dxa" w:w="2412"/>
-          </w:tcPr>
-          <w:p>
-            <w:pPr>
-              <w:spacing w:after="40"/>
-            </w:pPr>
-            <w:r/>
-            <w:r>
-              <w:rPr>
-                <w:rFonts w:ascii="SimSun" w:hAnsi="SimSun" w:eastAsia="宋体"/>
-                <w:b w:val="0"/>
-                <w:sz w:val="19"/>
-              </w:rPr>
-              <w:t>只作为弱监督/诊断；主评估转向人工 bbox benchmark</w:t>
-            </w:r>
-          </w:p>
-        </w:tc>
-      </w:tr>
-      <w:tr>
-        <w:tc>
-          <w:tcPr>
-            <w:tcW w:type="dxa" w:w="2412"/>
-          </w:tcPr>
-          <w:p>
-            <w:pPr>
-              <w:spacing w:after="40"/>
-            </w:pPr>
-            <w:r/>
-            <w:r>
-              <w:rPr>
-                <w:rFonts w:ascii="SimSun" w:hAnsi="SimSun" w:eastAsia="宋体"/>
-                <w:b w:val="0"/>
-                <w:sz w:val="19"/>
-              </w:rPr>
-              <w:t>排序模型</w:t>
-            </w:r>
-          </w:p>
-        </w:tc>
-        <w:tc>
-          <w:tcPr>
-            <w:tcW w:type="dxa" w:w="2412"/>
-          </w:tcPr>
-          <w:p>
-            <w:pPr>
-              <w:spacing w:after="40"/>
-            </w:pPr>
-            <w:r/>
-            <w:r>
-              <w:rPr>
-                <w:rFonts w:ascii="SimSun" w:hAnsi="SimSun" w:eastAsia="宋体"/>
-                <w:b w:val="0"/>
-                <w:sz w:val="19"/>
-              </w:rPr>
-              <w:t>hash ranker / listwise context ranker</w:t>
-            </w:r>
-          </w:p>
-        </w:tc>
-        <w:tc>
-          <w:tcPr>
-            <w:tcW w:type="dxa" w:w="2412"/>
-          </w:tcPr>
-          <w:p>
-            <w:pPr>
-              <w:spacing w:after="40"/>
-            </w:pPr>
-            <w:r/>
-            <w:r>
-              <w:rPr>
-                <w:rFonts w:ascii="SimSun" w:hAnsi="SimSun" w:eastAsia="宋体"/>
-                <w:b w:val="0"/>
-                <w:sz w:val="19"/>
-              </w:rPr>
-              <w:t>候选级指标好，但 manual/full pipeline 不稳定</w:t>
-            </w:r>
-          </w:p>
-        </w:tc>
-        <w:tc>
-          <w:tcPr>
-            <w:tcW w:type="dxa" w:w="2412"/>
-          </w:tcPr>
-          <w:p>
-            <w:pPr>
-              <w:spacing w:after="40"/>
-            </w:pPr>
-            <w:r/>
-            <w:r>
-              <w:rPr>
-                <w:rFonts w:ascii="SimSun" w:hAnsi="SimSun" w:eastAsia="宋体"/>
-                <w:b w:val="0"/>
-                <w:sz w:val="19"/>
-              </w:rPr>
-              <w:t>从 online path 关掉，保留为 archived experiment</w:t>
-            </w:r>
-          </w:p>
-        </w:tc>
-      </w:tr>
-      <w:tr>
-        <w:tc>
-          <w:tcPr>
-            <w:tcW w:type="dxa" w:w="2412"/>
-          </w:tcPr>
-          <w:p>
-            <w:pPr>
-              <w:spacing w:after="40"/>
-            </w:pPr>
-            <w:r/>
-            <w:r>
-              <w:rPr>
-                <w:rFonts w:ascii="SimSun" w:hAnsi="SimSun" w:eastAsia="宋体"/>
-                <w:b w:val="0"/>
-                <w:sz w:val="19"/>
-              </w:rPr>
-              <w:t>文档路线</w:t>
-            </w:r>
-          </w:p>
-        </w:tc>
-        <w:tc>
-          <w:tcPr>
-            <w:tcW w:type="dxa" w:w="2412"/>
-          </w:tcPr>
-          <w:p>
-            <w:pPr>
-              <w:spacing w:after="40"/>
-            </w:pPr>
-            <w:r/>
-            <w:r>
-              <w:rPr>
-                <w:rFonts w:ascii="SimSun" w:hAnsi="SimSun" w:eastAsia="宋体"/>
-                <w:b w:val="0"/>
-                <w:sz w:val="19"/>
-              </w:rPr>
-              <w:t>先尝试用 DeepFashion2 弱监督训练</w:t>
-            </w:r>
-          </w:p>
-        </w:tc>
-        <w:tc>
-          <w:tcPr>
-            <w:tcW w:type="dxa" w:w="2412"/>
-          </w:tcPr>
-          <w:p>
-            <w:pPr>
-              <w:spacing w:after="40"/>
-            </w:pPr>
-            <w:r/>
-            <w:r>
-              <w:rPr>
-                <w:rFonts w:ascii="SimSun" w:hAnsi="SimSun" w:eastAsia="宋体"/>
-                <w:b w:val="0"/>
-                <w:sz w:val="19"/>
-              </w:rPr>
-              <w:t>和 PRD 中 DINOv2/CLIP 图文匹配方向不完全一致</w:t>
-            </w:r>
-          </w:p>
-        </w:tc>
-        <w:tc>
-          <w:tcPr>
-            <w:tcW w:type="dxa" w:w="2412"/>
-          </w:tcPr>
-          <w:p>
-            <w:pPr>
-              <w:spacing w:after="40"/>
-            </w:pPr>
-            <w:r/>
-            <w:r>
-              <w:rPr>
-                <w:rFonts w:ascii="SimSun" w:hAnsi="SimSun" w:eastAsia="宋体"/>
-                <w:b w:val="0"/>
-                <w:sz w:val="19"/>
-              </w:rPr>
-              <w:t>下一步做 pretrained grounding baseline</w:t>
-            </w:r>
-          </w:p>
-        </w:tc>
-      </w:tr>
-      <w:tr>
-        <w:tc>
-          <w:tcPr>
-            <w:tcW w:type="dxa" w:w="2412"/>
-          </w:tcPr>
-          <w:p>
-            <w:pPr>
-              <w:spacing w:after="40"/>
-            </w:pPr>
-            <w:r/>
-            <w:r>
-              <w:rPr>
-                <w:rFonts w:ascii="SimSun" w:hAnsi="SimSun" w:eastAsia="宋体"/>
-                <w:b w:val="0"/>
-                <w:sz w:val="19"/>
-              </w:rPr>
-              <w:t>线上策略</w:t>
-            </w:r>
-          </w:p>
-        </w:tc>
-        <w:tc>
-          <w:tcPr>
-            <w:tcW w:type="dxa" w:w="2412"/>
-          </w:tcPr>
-          <w:p>
-            <w:pPr>
-              <w:spacing w:after="40"/>
-            </w:pPr>
-            <w:r/>
-            <w:r>
-              <w:rPr>
-                <w:rFonts w:ascii="SimSun" w:hAnsi="SimSun" w:eastAsia="宋体"/>
-                <w:b w:val="0"/>
-                <w:sz w:val="19"/>
-              </w:rPr>
-              <w:t>可选传入 --ranker-checkpoint</w:t>
-            </w:r>
-          </w:p>
-        </w:tc>
-        <w:tc>
-          <w:tcPr>
-            <w:tcW w:type="dxa" w:w="2412"/>
-          </w:tcPr>
-          <w:p>
-            <w:pPr>
-              <w:spacing w:after="40"/>
-            </w:pPr>
-            <w:r/>
-            <w:r>
-              <w:rPr>
-                <w:rFonts w:ascii="SimSun" w:hAnsi="SimSun" w:eastAsia="宋体"/>
-                <w:b w:val="0"/>
-                <w:sz w:val="19"/>
-              </w:rPr>
-              <w:t>误传 checkpoint 可能让结果变差</w:t>
-            </w:r>
-          </w:p>
-        </w:tc>
-        <w:tc>
-          <w:tcPr>
-            <w:tcW w:type="dxa" w:w="2412"/>
-          </w:tcPr>
-          <w:p>
-            <w:pPr>
-              <w:spacing w:after="40"/>
-            </w:pPr>
-            <w:r/>
-            <w:r>
-              <w:rPr>
-                <w:rFonts w:ascii="SimSun" w:hAnsi="SimSun" w:eastAsia="宋体"/>
-                <w:b w:val="0"/>
-                <w:sz w:val="19"/>
-              </w:rPr>
-              <w:t>默认 heuristic-only，只有超过 manual benchmark 才接入新 backend</w:t>
+              <w:t>整体提升，cuff 仍是瓶颈</w:t>
             </w:r>
           </w:p>
         </w:tc>
@@ -1998,7 +831,7 @@
           <w:rFonts w:ascii="SimSun" w:hAnsi="SimSun" w:eastAsia="宋体"/>
           <w:sz w:val="24"/>
         </w:rPr>
-        <w:t>因此，当前 3.1.2 的重新定位是：heuristic-only 作为线上 baseline，manual benchmark 作为主要评估标准；后续新增 GroundingDINO、OWL-ViT/OWL-V2、Chinese-CLIP 或 CLIP + 中文到英文 prompt mapping 的离线 baseline。只有当新模型在 122 条人工 benchmark 上超过 heuristic baseline，才考虑接入 online path。</w:t>
+        <w:t>Failure review 后主要修正了三类问题：cuff 增加 upper-sleeve / lower-terminal 候选；pocket 左右方向改为服饰/穿着者左右；waist 根据 garment category 使用不同纵向区域。pocket 和 waist 提升明显，但 cuff 仍然较弱，说明纯几何规则接近上限。</w:t>
       </w:r>
     </w:p>
     <w:p>
@@ -2006,7 +839,7 @@
         <w:pStyle w:val="Heading1"/>
       </w:pPr>
       <w:r>
-        <w:t>六、代码与文档整理</w:t>
+        <w:t>四、当前判断</w:t>
       </w:r>
     </w:p>
     <w:p>
@@ -2019,7 +852,7 @@
           <w:rFonts w:ascii="SimSun" w:hAnsi="SimSun" w:eastAsia="宋体"/>
           <w:sz w:val="24"/>
         </w:rPr>
-        <w:t>将 README、AutoDL setup 和 3.1.2 plan 统一改为 manual benchmark + pretrained grounding 的新路线。</w:t>
+        <w:t>DeepFashion2 有 mask、bbox、category 和 landmark，但没有 query-level 语言区域人工标注，不能单独支撑 3.1.2 的完整训练。</w:t>
       </w:r>
     </w:p>
     <w:p>
@@ -2032,7 +865,7 @@
           <w:rFonts w:ascii="SimSun" w:hAnsi="SimSun" w:eastAsia="宋体"/>
           <w:sz w:val="24"/>
         </w:rPr>
-        <w:t>在文档中明确 weak-label 指标只能作为 development diagnostics，不能作为最终 PRD accuracy。</w:t>
+        <w:t>weak-label ranker 可以作为历史实验和辅助诊断，但不能作为 PRD 级语言 grounding 的主要结论。</w:t>
       </w:r>
     </w:p>
     <w:p>
@@ -2045,7 +878,7 @@
           <w:rFonts w:ascii="SimSun" w:hAnsi="SimSun" w:eastAsia="宋体"/>
           <w:sz w:val="24"/>
         </w:rPr>
-        <w:t>将 candidate-listwise ranker 标记为 archived weak-supervision experiment，不再作为默认 online baseline。</w:t>
+        <w:t>当前 online policy 固定为 heuristic-only；只有新模型超过 manual benchmark，才考虑接入 online path。</w:t>
       </w:r>
     </w:p>
     <w:p>
@@ -2058,7 +891,7 @@
           <w:rFonts w:ascii="SimSun" w:hAnsi="SimSun" w:eastAsia="宋体"/>
           <w:sz w:val="24"/>
         </w:rPr>
-        <w:t>代码中保持 heuristic-only online policy，并保留人工标注、合并、评估和 failure export 工具作为统一评估入口。</w:t>
+        <w:t>3.1.2 后续主线应回到预训练 grounding / 图文匹配：GroundingDINO、OWL-ViT/OWL-V2、Chinese-CLIP 或 CLIP prompt mapping。</w:t>
       </w:r>
     </w:p>
     <w:p>
@@ -2066,7 +899,7 @@
         <w:pStyle w:val="Heading1"/>
       </w:pPr>
       <w:r>
-        <w:t>七、下周计划</w:t>
+        <w:t>五、下周计划</w:t>
       </w:r>
     </w:p>
     <w:p>
@@ -2092,7 +925,7 @@
           <w:rFonts w:ascii="SimSun" w:hAnsi="SimSun" w:eastAsia="宋体"/>
           <w:sz w:val="24"/>
         </w:rPr>
-        <w:t>优先验证 GroundingDINO 或 OWL-ViT/OWL-V2；如果模型偏英文，增加中文 query 到英文 prompt 的模板映射。</w:t>
+        <w:t>优先验证 GroundingDINO 或 OWL-ViT/OWL-V2；若模型偏英文，增加中文 query 到英文 prompt 的模板映射。</w:t>
       </w:r>
     </w:p>
     <w:p>
@@ -2118,12 +951,12 @@
           <w:rFonts w:ascii="SimSun" w:hAnsi="SimSun" w:eastAsia="宋体"/>
           <w:sz w:val="24"/>
         </w:rPr>
-        <w:t>重点比较 cuff、pocket、zipper、pattern 等规则困难区域，并只做小规模、有目标的补充标注。</w:t>
+        <w:t>重点比较 cuff、pocket、zipper、pattern 等规则困难区域；如需继续标注，只做小规模、有目标的补充标注。</w:t>
       </w:r>
     </w:p>
     <w:sectPr>
       <w:pgSz w:w="12240" w:h="15840"/>
-      <w:pgMar w:top="1008" w:right="1296" w:bottom="1008" w:left="1296" w:header="720" w:footer="720" w:gutter="0"/>
+      <w:pgMar w:top="1080" w:right="1296" w:bottom="1080" w:left="1296" w:header="720" w:footer="720" w:gutter="0"/>
       <w:cols w:space="720"/>
       <w:docGrid w:linePitch="360"/>
     </w:sectPr>

</xml_diff>